<commit_message>
Capteur NoeudChauffageSdb : boîtier imprimé + fiche mise à jour
- Capteur/boitier/NoeudChauffageSdb : boitier_noeud.scad (Customizer), STL boîte et
  couvercle, aperçus, fiche « Boîtier NoeudChauffageSdb » (.md + .docx).
  Fixé au mur, couvercle face au chauffage : micro MAX4466 vissé derrière une grille,
  2 LED IR et 2 LED témoins dans le couvercle, fente USB-C à gauche, câble 12 V seul
  sortant à droite avec serre-câble, antenne Wi-Fi contre la paroi basse.
- Fiche NoeudChauffageSdb + liste des composants : LED IR = Everlight IR333C-A
  (5 mm, 940 nm ; R3 22 Ω ≈ 90 mA), § 6 boîtier, Hammond abandonné.

Co-Authored-By: Claude Opus 5.5 <noreply@anthropic.com>
</commit_message>
<xml_diff>
--- a/Capteur/pcb/NoeudChauffageSdb/Composants.docx
+++ b/Capteur/pcb/NoeudChauffageSdb/Composants.docx
@@ -2462,9 +2462,9 @@
         </w:tblBorders>
       </w:tblPr>
       <w:tblGrid>
-        <w:gridCol w:w="4778"/>
-        <w:gridCol w:w="330"/>
-        <w:gridCol w:w="4530"/>
+        <w:gridCol w:w="3258"/>
+        <w:gridCol w:w="339"/>
+        <w:gridCol w:w="6041"/>
       </w:tblGrid>
       <w:tr>
         <w:trPr>
@@ -2472,7 +2472,7 @@
         </w:trPr>
         <w:tc>
           <w:tcPr>
-            <w:tcW w:type="dxa" w:w="4778"/>
+            <w:tcW w:type="dxa" w:w="3258"/>
             <w:tcBorders>
               <w:top w:val="single" w:color="999999" w:sz="4"/>
               <w:left w:val="single" w:color="999999" w:sz="4"/>
@@ -2499,7 +2499,7 @@
         </w:tc>
         <w:tc>
           <w:tcPr>
-            <w:tcW w:type="dxa" w:w="330"/>
+            <w:tcW w:type="dxa" w:w="339"/>
             <w:tcBorders>
               <w:top w:val="single" w:color="999999" w:sz="4"/>
               <w:left w:val="single" w:color="999999" w:sz="4"/>
@@ -2526,7 +2526,7 @@
         </w:tc>
         <w:tc>
           <w:tcPr>
-            <w:tcW w:type="dxa" w:w="4530"/>
+            <w:tcW w:type="dxa" w:w="6041"/>
             <w:tcBorders>
               <w:top w:val="single" w:color="999999" w:sz="4"/>
               <w:left w:val="single" w:color="999999" w:sz="4"/>
@@ -2558,7 +2558,7 @@
         </w:trPr>
         <w:tc>
           <w:tcPr>
-            <w:tcW w:type="dxa" w:w="4778"/>
+            <w:tcW w:type="dxa" w:w="3258"/>
             <w:tcBorders>
               <w:top w:val="single" w:color="999999" w:sz="4"/>
               <w:left w:val="single" w:color="999999" w:sz="4"/>
@@ -2580,7 +2580,7 @@
         </w:tc>
         <w:tc>
           <w:tcPr>
-            <w:tcW w:type="dxa" w:w="330"/>
+            <w:tcW w:type="dxa" w:w="339"/>
             <w:tcBorders>
               <w:top w:val="single" w:color="999999" w:sz="4"/>
               <w:left w:val="single" w:color="999999" w:sz="4"/>
@@ -2602,7 +2602,7 @@
         </w:tc>
         <w:tc>
           <w:tcPr>
-            <w:tcW w:type="dxa" w:w="4530"/>
+            <w:tcW w:type="dxa" w:w="6041"/>
             <w:tcBorders>
               <w:top w:val="single" w:color="999999" w:sz="4"/>
               <w:left w:val="single" w:color="999999" w:sz="4"/>
@@ -2629,7 +2629,7 @@
         </w:trPr>
         <w:tc>
           <w:tcPr>
-            <w:tcW w:type="dxa" w:w="4778"/>
+            <w:tcW w:type="dxa" w:w="3258"/>
             <w:tcBorders>
               <w:top w:val="single" w:color="999999" w:sz="4"/>
               <w:left w:val="single" w:color="999999" w:sz="4"/>
@@ -2651,7 +2651,7 @@
         </w:tc>
         <w:tc>
           <w:tcPr>
-            <w:tcW w:type="dxa" w:w="330"/>
+            <w:tcW w:type="dxa" w:w="339"/>
             <w:tcBorders>
               <w:top w:val="single" w:color="999999" w:sz="4"/>
               <w:left w:val="single" w:color="999999" w:sz="4"/>
@@ -2673,7 +2673,7 @@
         </w:tc>
         <w:tc>
           <w:tcPr>
-            <w:tcW w:type="dxa" w:w="4530"/>
+            <w:tcW w:type="dxa" w:w="6041"/>
             <w:tcBorders>
               <w:top w:val="single" w:color="999999" w:sz="4"/>
               <w:left w:val="single" w:color="999999" w:sz="4"/>
@@ -2700,7 +2700,7 @@
         </w:trPr>
         <w:tc>
           <w:tcPr>
-            <w:tcW w:type="dxa" w:w="4778"/>
+            <w:tcW w:type="dxa" w:w="3258"/>
             <w:tcBorders>
               <w:top w:val="single" w:color="999999" w:sz="4"/>
               <w:left w:val="single" w:color="999999" w:sz="4"/>
@@ -2722,7 +2722,7 @@
         </w:tc>
         <w:tc>
           <w:tcPr>
-            <w:tcW w:type="dxa" w:w="330"/>
+            <w:tcW w:type="dxa" w:w="339"/>
             <w:tcBorders>
               <w:top w:val="single" w:color="999999" w:sz="4"/>
               <w:left w:val="single" w:color="999999" w:sz="4"/>
@@ -2744,7 +2744,7 @@
         </w:tc>
         <w:tc>
           <w:tcPr>
-            <w:tcW w:type="dxa" w:w="4530"/>
+            <w:tcW w:type="dxa" w:w="6041"/>
             <w:tcBorders>
               <w:top w:val="single" w:color="999999" w:sz="4"/>
               <w:left w:val="single" w:color="999999" w:sz="4"/>
@@ -2771,29 +2771,29 @@
         </w:trPr>
         <w:tc>
           <w:tcPr>
-            <w:tcW w:type="dxa" w:w="4778"/>
-            <w:tcBorders>
-              <w:top w:val="single" w:color="999999" w:sz="4"/>
-              <w:left w:val="single" w:color="999999" w:sz="4"/>
-              <w:bottom w:val="single" w:color="999999" w:sz="4"/>
-              <w:right w:val="single" w:color="999999" w:sz="4"/>
-            </w:tcBorders>
-            <w:tcMar>
-              <w:top w:type="dxa" w:w="60"/>
-              <w:left w:type="dxa" w:w="100"/>
-              <w:bottom w:type="dxa" w:w="60"/>
-              <w:right w:type="dxa" w:w="100"/>
-            </w:tcMar>
-          </w:tcPr>
-          <w:p>
-            <w:r>
-              <w:t xml:space="preserve">LED infrarouge HIR204C</w:t>
-            </w:r>
-          </w:p>
-        </w:tc>
-        <w:tc>
-          <w:tcPr>
-            <w:tcW w:type="dxa" w:w="330"/>
+            <w:tcW w:type="dxa" w:w="3258"/>
+            <w:tcBorders>
+              <w:top w:val="single" w:color="999999" w:sz="4"/>
+              <w:left w:val="single" w:color="999999" w:sz="4"/>
+              <w:bottom w:val="single" w:color="999999" w:sz="4"/>
+              <w:right w:val="single" w:color="999999" w:sz="4"/>
+            </w:tcBorders>
+            <w:tcMar>
+              <w:top w:type="dxa" w:w="60"/>
+              <w:left w:type="dxa" w:w="100"/>
+              <w:bottom w:type="dxa" w:w="60"/>
+              <w:right w:type="dxa" w:w="100"/>
+            </w:tcMar>
+          </w:tcPr>
+          <w:p>
+            <w:r>
+              <w:t xml:space="preserve">LED infrarouge Everlight IR333C-A (5 mm, 940 nm)</w:t>
+            </w:r>
+          </w:p>
+        </w:tc>
+        <w:tc>
+          <w:tcPr>
+            <w:tcW w:type="dxa" w:w="339"/>
             <w:tcBorders>
               <w:top w:val="single" w:color="999999" w:sz="4"/>
               <w:left w:val="single" w:color="999999" w:sz="4"/>
@@ -2815,23 +2815,23 @@
         </w:tc>
         <w:tc>
           <w:tcPr>
-            <w:tcW w:type="dxa" w:w="4530"/>
-            <w:tcBorders>
-              <w:top w:val="single" w:color="999999" w:sz="4"/>
-              <w:left w:val="single" w:color="999999" w:sz="4"/>
-              <w:bottom w:val="single" w:color="999999" w:sz="4"/>
-              <w:right w:val="single" w:color="999999" w:sz="4"/>
-            </w:tcBorders>
-            <w:tcMar>
-              <w:top w:type="dxa" w:w="60"/>
-              <w:left w:type="dxa" w:w="100"/>
-              <w:bottom w:type="dxa" w:w="60"/>
-              <w:right w:type="dxa" w:w="100"/>
-            </w:tcMar>
-          </w:tcPr>
-          <w:p>
-            <w:r>
-              <w:t xml:space="preserve">en série, sur fil, face au récepteur du chauffage</w:t>
+            <w:tcW w:type="dxa" w:w="6041"/>
+            <w:tcBorders>
+              <w:top w:val="single" w:color="999999" w:sz="4"/>
+              <w:left w:val="single" w:color="999999" w:sz="4"/>
+              <w:bottom w:val="single" w:color="999999" w:sz="4"/>
+              <w:right w:val="single" w:color="999999" w:sz="4"/>
+            </w:tcBorders>
+            <w:tcMar>
+              <w:top w:type="dxa" w:w="60"/>
+              <w:left w:type="dxa" w:w="100"/>
+              <w:bottom w:type="dxa" w:w="60"/>
+              <w:right w:type="dxa" w:w="100"/>
+            </w:tcMar>
+          </w:tcPr>
+          <w:p>
+            <w:r>
+              <w:t xml:space="preserve">en série, sur fil, dans le couvercle face au chauffage</w:t>
             </w:r>
           </w:p>
         </w:tc>
@@ -2842,7 +2842,7 @@
         </w:trPr>
         <w:tc>
           <w:tcPr>
-            <w:tcW w:type="dxa" w:w="4778"/>
+            <w:tcW w:type="dxa" w:w="3258"/>
             <w:tcBorders>
               <w:top w:val="single" w:color="999999" w:sz="4"/>
               <w:left w:val="single" w:color="999999" w:sz="4"/>
@@ -2864,7 +2864,7 @@
         </w:tc>
         <w:tc>
           <w:tcPr>
-            <w:tcW w:type="dxa" w:w="330"/>
+            <w:tcW w:type="dxa" w:w="339"/>
             <w:tcBorders>
               <w:top w:val="single" w:color="999999" w:sz="4"/>
               <w:left w:val="single" w:color="999999" w:sz="4"/>
@@ -2886,7 +2886,7 @@
         </w:tc>
         <w:tc>
           <w:tcPr>
-            <w:tcW w:type="dxa" w:w="4530"/>
+            <w:tcW w:type="dxa" w:w="6041"/>
             <w:tcBorders>
               <w:top w:val="single" w:color="999999" w:sz="4"/>
               <w:left w:val="single" w:color="999999" w:sz="4"/>
@@ -2913,7 +2913,7 @@
         </w:trPr>
         <w:tc>
           <w:tcPr>
-            <w:tcW w:type="dxa" w:w="4778"/>
+            <w:tcW w:type="dxa" w:w="3258"/>
             <w:tcBorders>
               <w:top w:val="single" w:color="999999" w:sz="4"/>
               <w:left w:val="single" w:color="999999" w:sz="4"/>
@@ -2935,7 +2935,7 @@
         </w:tc>
         <w:tc>
           <w:tcPr>
-            <w:tcW w:type="dxa" w:w="330"/>
+            <w:tcW w:type="dxa" w:w="339"/>
             <w:tcBorders>
               <w:top w:val="single" w:color="999999" w:sz="4"/>
               <w:left w:val="single" w:color="999999" w:sz="4"/>
@@ -2957,7 +2957,7 @@
         </w:tc>
         <w:tc>
           <w:tcPr>
-            <w:tcW w:type="dxa" w:w="4530"/>
+            <w:tcW w:type="dxa" w:w="6041"/>
             <w:tcBorders>
               <w:top w:val="single" w:color="999999" w:sz="4"/>
               <w:left w:val="single" w:color="999999" w:sz="4"/>
@@ -2984,7 +2984,7 @@
         </w:trPr>
         <w:tc>
           <w:tcPr>
-            <w:tcW w:type="dxa" w:w="4778"/>
+            <w:tcW w:type="dxa" w:w="3258"/>
             <w:tcBorders>
               <w:top w:val="single" w:color="999999" w:sz="4"/>
               <w:left w:val="single" w:color="999999" w:sz="4"/>
@@ -3006,7 +3006,7 @@
         </w:tc>
         <w:tc>
           <w:tcPr>
-            <w:tcW w:type="dxa" w:w="330"/>
+            <w:tcW w:type="dxa" w:w="339"/>
             <w:tcBorders>
               <w:top w:val="single" w:color="999999" w:sz="4"/>
               <w:left w:val="single" w:color="999999" w:sz="4"/>
@@ -3028,7 +3028,7 @@
         </w:tc>
         <w:tc>
           <w:tcPr>
-            <w:tcW w:type="dxa" w:w="4530"/>
+            <w:tcW w:type="dxa" w:w="6041"/>
             <w:tcBorders>
               <w:top w:val="single" w:color="999999" w:sz="4"/>
               <w:left w:val="single" w:color="999999" w:sz="4"/>
@@ -3055,7 +3055,7 @@
         </w:trPr>
         <w:tc>
           <w:tcPr>
-            <w:tcW w:type="dxa" w:w="4778"/>
+            <w:tcW w:type="dxa" w:w="3258"/>
             <w:tcBorders>
               <w:top w:val="single" w:color="999999" w:sz="4"/>
               <w:left w:val="single" w:color="999999" w:sz="4"/>
@@ -3077,7 +3077,7 @@
         </w:tc>
         <w:tc>
           <w:tcPr>
-            <w:tcW w:type="dxa" w:w="330"/>
+            <w:tcW w:type="dxa" w:w="339"/>
             <w:tcBorders>
               <w:top w:val="single" w:color="999999" w:sz="4"/>
               <w:left w:val="single" w:color="999999" w:sz="4"/>
@@ -3099,23 +3099,31 @@
         </w:tc>
         <w:tc>
           <w:tcPr>
-            <w:tcW w:type="dxa" w:w="4530"/>
-            <w:tcBorders>
-              <w:top w:val="single" w:color="999999" w:sz="4"/>
-              <w:left w:val="single" w:color="999999" w:sz="4"/>
-              <w:bottom w:val="single" w:color="999999" w:sz="4"/>
-              <w:right w:val="single" w:color="999999" w:sz="4"/>
-            </w:tcBorders>
-            <w:tcMar>
-              <w:top w:type="dxa" w:w="60"/>
-              <w:left w:type="dxa" w:w="100"/>
-              <w:bottom w:type="dxa" w:w="60"/>
-              <w:right w:type="dxa" w:w="100"/>
-            </w:tcMar>
-          </w:tcPr>
-          <w:p>
-            <w:r>
-              <w:t xml:space="preserve">LED témoins visibles (fenêtre ou couvercle translucide)</w:t>
+            <w:tcW w:type="dxa" w:w="6041"/>
+            <w:tcBorders>
+              <w:top w:val="single" w:color="999999" w:sz="4"/>
+              <w:left w:val="single" w:color="999999" w:sz="4"/>
+              <w:bottom w:val="single" w:color="999999" w:sz="4"/>
+              <w:right w:val="single" w:color="999999" w:sz="4"/>
+            </w:tcBorders>
+            <w:tcMar>
+              <w:top w:type="dxa" w:w="60"/>
+              <w:left w:type="dxa" w:w="100"/>
+              <w:bottom w:type="dxa" w:w="60"/>
+              <w:right w:type="dxa" w:w="100"/>
+            </w:tcMar>
+          </w:tcPr>
+          <w:p>
+            <w:r>
+              <w:rPr>
+                <w:rFonts w:ascii="Consolas" w:cs="Consolas" w:eastAsia="Consolas" w:hAnsi="Consolas"/>
+                <w:sz w:val="19"/>
+                <w:szCs w:val="19"/>
+              </w:rPr>
+              <w:t xml:space="preserve">Capteur/boitier/NoeudChauffageSdb/</w:t>
+            </w:r>
+            <w:r>
+              <w:t xml:space="preserve"> (boîte + couvercle, PETG)</w:t>
             </w:r>
           </w:p>
         </w:tc>
@@ -3126,78 +3134,138 @@
         </w:trPr>
         <w:tc>
           <w:tcPr>
-            <w:tcW w:type="dxa" w:w="4778"/>
-            <w:tcBorders>
-              <w:top w:val="single" w:color="999999" w:sz="4"/>
-              <w:left w:val="single" w:color="999999" w:sz="4"/>
-              <w:bottom w:val="single" w:color="999999" w:sz="4"/>
-              <w:right w:val="single" w:color="999999" w:sz="4"/>
-            </w:tcBorders>
-            <w:tcMar>
-              <w:top w:type="dxa" w:w="60"/>
-              <w:left w:type="dxa" w:w="100"/>
-              <w:bottom w:type="dxa" w:w="60"/>
-              <w:right w:type="dxa" w:w="100"/>
-            </w:tcMar>
-          </w:tcPr>
-          <w:p>
-            <w:r>
-              <w:t xml:space="preserve">Option : boîtier Hammond 1554C2GYCL + 3 presse-étoupes PG7</w:t>
-            </w:r>
-          </w:p>
-        </w:tc>
-        <w:tc>
-          <w:tcPr>
-            <w:tcW w:type="dxa" w:w="330"/>
-            <w:tcBorders>
-              <w:top w:val="single" w:color="999999" w:sz="4"/>
-              <w:left w:val="single" w:color="999999" w:sz="4"/>
-              <w:bottom w:val="single" w:color="999999" w:sz="4"/>
-              <w:right w:val="single" w:color="999999" w:sz="4"/>
-            </w:tcBorders>
-            <w:tcMar>
-              <w:top w:type="dxa" w:w="60"/>
-              <w:left w:type="dxa" w:w="100"/>
-              <w:bottom w:type="dxa" w:w="60"/>
-              <w:right w:type="dxa" w:w="100"/>
-            </w:tcMar>
-          </w:tcPr>
-          <w:p>
-            <w:r>
-              <w:t xml:space="preserve">1</w:t>
-            </w:r>
-          </w:p>
-        </w:tc>
-        <w:tc>
-          <w:tcPr>
-            <w:tcW w:type="dxa" w:w="4530"/>
-            <w:tcBorders>
-              <w:top w:val="single" w:color="999999" w:sz="4"/>
-              <w:left w:val="single" w:color="999999" w:sz="4"/>
-              <w:bottom w:val="single" w:color="999999" w:sz="4"/>
-              <w:right w:val="single" w:color="999999" w:sz="4"/>
-            </w:tcBorders>
-            <w:tcMar>
-              <w:top w:type="dxa" w:w="60"/>
-              <w:left w:type="dxa" w:w="100"/>
-              <w:bottom w:type="dxa" w:w="60"/>
-              <w:right w:type="dxa" w:w="100"/>
-            </w:tcMar>
-          </w:tcPr>
-          <w:p>
-            <w:r>
-              <w:t xml:space="preserve">voir </w:t>
-            </w:r>
-            <w:r>
-              <w:rPr>
-                <w:rFonts w:ascii="Consolas" w:cs="Consolas" w:eastAsia="Consolas" w:hAnsi="Consolas"/>
-                <w:sz w:val="19"/>
-                <w:szCs w:val="19"/>
-              </w:rPr>
-              <w:t xml:space="preserve">NoeudChauffageSdb.md</w:t>
-            </w:r>
-            <w:r>
-              <w:t xml:space="preserve"> § 6</w:t>
+            <w:tcW w:type="dxa" w:w="3258"/>
+            <w:tcBorders>
+              <w:top w:val="single" w:color="999999" w:sz="4"/>
+              <w:left w:val="single" w:color="999999" w:sz="4"/>
+              <w:bottom w:val="single" w:color="999999" w:sz="4"/>
+              <w:right w:val="single" w:color="999999" w:sz="4"/>
+            </w:tcBorders>
+            <w:tcMar>
+              <w:top w:type="dxa" w:w="60"/>
+              <w:left w:type="dxa" w:w="100"/>
+              <w:bottom w:type="dxa" w:w="60"/>
+              <w:right w:type="dxa" w:w="100"/>
+            </w:tcMar>
+          </w:tcPr>
+          <w:p>
+            <w:r>
+              <w:t xml:space="preserve">Vis du boîtier</w:t>
+            </w:r>
+          </w:p>
+        </w:tc>
+        <w:tc>
+          <w:tcPr>
+            <w:tcW w:type="dxa" w:w="339"/>
+            <w:tcBorders>
+              <w:top w:val="single" w:color="999999" w:sz="4"/>
+              <w:left w:val="single" w:color="999999" w:sz="4"/>
+              <w:bottom w:val="single" w:color="999999" w:sz="4"/>
+              <w:right w:val="single" w:color="999999" w:sz="4"/>
+            </w:tcBorders>
+            <w:tcMar>
+              <w:top w:type="dxa" w:w="60"/>
+              <w:left w:type="dxa" w:w="100"/>
+              <w:bottom w:type="dxa" w:w="60"/>
+              <w:right w:type="dxa" w:w="100"/>
+            </w:tcMar>
+          </w:tcPr>
+          <w:p>
+            <w:r>
+              <w:t xml:space="preserve">–</w:t>
+            </w:r>
+          </w:p>
+        </w:tc>
+        <w:tc>
+          <w:tcPr>
+            <w:tcW w:type="dxa" w:w="6041"/>
+            <w:tcBorders>
+              <w:top w:val="single" w:color="999999" w:sz="4"/>
+              <w:left w:val="single" w:color="999999" w:sz="4"/>
+              <w:bottom w:val="single" w:color="999999" w:sz="4"/>
+              <w:right w:val="single" w:color="999999" w:sz="4"/>
+            </w:tcBorders>
+            <w:tcMar>
+              <w:top w:type="dxa" w:w="60"/>
+              <w:left w:type="dxa" w:w="100"/>
+              <w:bottom w:type="dxa" w:w="60"/>
+              <w:right w:type="dxa" w:w="100"/>
+            </w:tcMar>
+          </w:tcPr>
+          <w:p>
+            <w:r>
+              <w:t xml:space="preserve">4 vis à bois Ø 4 fraisées (mur), 4 M3 × 6 (carte), 4 M3 × 8 (couvercle), 2 M2 × 6 (micro)</w:t>
+            </w:r>
+          </w:p>
+        </w:tc>
+      </w:tr>
+      <w:tr>
+        <w:trPr>
+          <w:tblHeader w:val="off"/>
+        </w:trPr>
+        <w:tc>
+          <w:tcPr>
+            <w:tcW w:type="dxa" w:w="3258"/>
+            <w:tcBorders>
+              <w:top w:val="single" w:color="999999" w:sz="4"/>
+              <w:left w:val="single" w:color="999999" w:sz="4"/>
+              <w:bottom w:val="single" w:color="999999" w:sz="4"/>
+              <w:right w:val="single" w:color="999999" w:sz="4"/>
+            </w:tcBorders>
+            <w:tcMar>
+              <w:top w:type="dxa" w:w="60"/>
+              <w:left w:type="dxa" w:w="100"/>
+              <w:bottom w:type="dxa" w:w="60"/>
+              <w:right w:type="dxa" w:w="100"/>
+            </w:tcMar>
+          </w:tcPr>
+          <w:p>
+            <w:r>
+              <w:t xml:space="preserve">Collier de serrage 2,5 mm, rondelle de mousse</w:t>
+            </w:r>
+          </w:p>
+        </w:tc>
+        <w:tc>
+          <w:tcPr>
+            <w:tcW w:type="dxa" w:w="339"/>
+            <w:tcBorders>
+              <w:top w:val="single" w:color="999999" w:sz="4"/>
+              <w:left w:val="single" w:color="999999" w:sz="4"/>
+              <w:bottom w:val="single" w:color="999999" w:sz="4"/>
+              <w:right w:val="single" w:color="999999" w:sz="4"/>
+            </w:tcBorders>
+            <w:tcMar>
+              <w:top w:type="dxa" w:w="60"/>
+              <w:left w:type="dxa" w:w="100"/>
+              <w:bottom w:type="dxa" w:w="60"/>
+              <w:right w:type="dxa" w:w="100"/>
+            </w:tcMar>
+          </w:tcPr>
+          <w:p>
+            <w:r>
+              <w:t xml:space="preserve">1 + 1</w:t>
+            </w:r>
+          </w:p>
+        </w:tc>
+        <w:tc>
+          <w:tcPr>
+            <w:tcW w:type="dxa" w:w="6041"/>
+            <w:tcBorders>
+              <w:top w:val="single" w:color="999999" w:sz="4"/>
+              <w:left w:val="single" w:color="999999" w:sz="4"/>
+              <w:bottom w:val="single" w:color="999999" w:sz="4"/>
+              <w:right w:val="single" w:color="999999" w:sz="4"/>
+            </w:tcBorders>
+            <w:tcMar>
+              <w:top w:type="dxa" w:w="60"/>
+              <w:left w:type="dxa" w:w="100"/>
+              <w:bottom w:type="dxa" w:w="60"/>
+              <w:right w:type="dxa" w:w="100"/>
+            </w:tcMar>
+          </w:tcPr>
+          <w:p>
+            <w:r>
+              <w:t xml:space="preserve">serre-câble 12 V ; mousse autour de la capsule du micro</w:t>
             </w:r>
           </w:p>
         </w:tc>

</xml_diff>